<commit_message>
change in the sow document not mastercard
</commit_message>
<xml_diff>
--- a/frontend/public/new-york/pdfs/sow.docx
+++ b/frontend/public/new-york/pdfs/sow.docx
@@ -190,7 +190,19 @@
               <w:rPr>
                 <w:color w:val="030C40"/>
               </w:rPr>
-              <w:t>Mastercard</w:t>
+              <w:t>[</w:t>
+            </w:r>
+            <w:r>
+              <w:rPr>
+                <w:color w:val="030C40"/>
+              </w:rPr>
+              <w:t>Customer</w:t>
+            </w:r>
+            <w:r>
+              <w:rPr>
+                <w:color w:val="030C40"/>
+              </w:rPr>
+              <w:t xml:space="preserve"> Name]</w:t>
             </w:r>
           </w:p>
         </w:tc>
@@ -15861,6 +15873,26 @@
 </file>
 
 <file path=customXml/item2.xml><?xml version="1.0" encoding="utf-8"?>
+<p:properties xmlns:p="http://schemas.microsoft.com/office/2006/metadata/properties" xmlns:xsi="http://www.w3.org/2001/XMLSchema-instance" xmlns:pc="http://schemas.microsoft.com/office/infopath/2007/PartnerControls">
+  <documentManagement>
+    <TaxCatchAll xmlns="0e72dab6-42b6-4491-a979-7607de6ce368" xsi:nil="true"/>
+    <lcf76f155ced4ddcb4097134ff3c332f xmlns="316e17ac-3f6f-4b27-9d00-daf60d20f2eb">
+      <Terms xmlns="http://schemas.microsoft.com/office/infopath/2007/PartnerControls"/>
+    </lcf76f155ced4ddcb4097134ff3c332f>
+  </documentManagement>
+</p:properties>
+</file>
+
+<file path=customXml/item3.xml><?xml version="1.0" encoding="utf-8"?>
+<?mso-contentType ?>
+<FormTemplates xmlns="http://schemas.microsoft.com/sharepoint/v3/contenttype/forms">
+  <Display>DocumentLibraryForm</Display>
+  <Edit>DocumentLibraryForm</Edit>
+  <New>DocumentLibraryForm</New>
+</FormTemplates>
+</file>
+
+<file path=customXml/item4.xml><?xml version="1.0" encoding="utf-8"?>
 <ct:contentTypeSchema xmlns:ct="http://schemas.microsoft.com/office/2006/metadata/contentType" xmlns:ma="http://schemas.microsoft.com/office/2006/metadata/properties/metaAttributes" ct:_="" ma:_="" ma:contentTypeName="Document" ma:contentTypeID="0x010100968F0059B1A7334AB6C012F8C89AE58A" ma:contentTypeVersion="14" ma:contentTypeDescription="Create a new document." ma:contentTypeScope="" ma:versionID="8681714c4e7be9029b4aa40a52bad5a9">
   <xsd:schema xmlns:xsd="http://www.w3.org/2001/XMLSchema" xmlns:xs="http://www.w3.org/2001/XMLSchema" xmlns:p="http://schemas.microsoft.com/office/2006/metadata/properties" xmlns:ns2="316e17ac-3f6f-4b27-9d00-daf60d20f2eb" xmlns:ns3="0e72dab6-42b6-4491-a979-7607de6ce368" targetNamespace="http://schemas.microsoft.com/office/2006/metadata/properties" ma:root="true" ma:fieldsID="9133d7f2d2ffdd47b6f960eab4ea75ed" ns2:_="" ns3:_="">
     <xsd:import namespace="316e17ac-3f6f-4b27-9d00-daf60d20f2eb"/>
@@ -16073,26 +16105,6 @@
 </ct:contentTypeSchema>
 </file>
 
-<file path=customXml/item3.xml><?xml version="1.0" encoding="utf-8"?>
-<?mso-contentType ?>
-<FormTemplates xmlns="http://schemas.microsoft.com/sharepoint/v3/contenttype/forms">
-  <Display>DocumentLibraryForm</Display>
-  <Edit>DocumentLibraryForm</Edit>
-  <New>DocumentLibraryForm</New>
-</FormTemplates>
-</file>
-
-<file path=customXml/item4.xml><?xml version="1.0" encoding="utf-8"?>
-<p:properties xmlns:p="http://schemas.microsoft.com/office/2006/metadata/properties" xmlns:xsi="http://www.w3.org/2001/XMLSchema-instance" xmlns:pc="http://schemas.microsoft.com/office/infopath/2007/PartnerControls">
-  <documentManagement>
-    <TaxCatchAll xmlns="0e72dab6-42b6-4491-a979-7607de6ce368" xsi:nil="true"/>
-    <lcf76f155ced4ddcb4097134ff3c332f xmlns="316e17ac-3f6f-4b27-9d00-daf60d20f2eb">
-      <Terms xmlns="http://schemas.microsoft.com/office/infopath/2007/PartnerControls"/>
-    </lcf76f155ced4ddcb4097134ff3c332f>
-  </documentManagement>
-</p:properties>
-</file>
-
 <file path=customXml/itemProps1.xml><?xml version="1.0" encoding="utf-8"?>
 <ds:datastoreItem xmlns:ds="http://schemas.openxmlformats.org/officeDocument/2006/customXml" ds:itemID="{EF278816-EC6F-A645-907D-7F25AECB1D4A}">
   <ds:schemaRefs>
@@ -16102,15 +16114,41 @@
 </file>
 
 <file path=customXml/itemProps2.xml><?xml version="1.0" encoding="utf-8"?>
-<ds:datastoreItem xmlns:ds="http://schemas.openxmlformats.org/officeDocument/2006/customXml" ds:itemID="{3734E2DA-EE48-45F5-BCED-921423D5FDCD}"/>
+<ds:datastoreItem xmlns:ds="http://schemas.openxmlformats.org/officeDocument/2006/customXml" ds:itemID="{C156A047-CF4F-4B15-B343-F838027B8778}">
+  <ds:schemaRefs>
+    <ds:schemaRef ds:uri="http://schemas.microsoft.com/office/2006/metadata/properties"/>
+    <ds:schemaRef ds:uri="http://schemas.microsoft.com/office/infopath/2007/PartnerControls"/>
+    <ds:schemaRef ds:uri="0e72dab6-42b6-4491-a979-7607de6ce368"/>
+    <ds:schemaRef ds:uri="316e17ac-3f6f-4b27-9d00-daf60d20f2eb"/>
+  </ds:schemaRefs>
+</ds:datastoreItem>
 </file>
 
 <file path=customXml/itemProps3.xml><?xml version="1.0" encoding="utf-8"?>
-<ds:datastoreItem xmlns:ds="http://schemas.openxmlformats.org/officeDocument/2006/customXml" ds:itemID="{93481E07-2ED6-4F16-8AC5-A2CFC51CF16E}"/>
+<ds:datastoreItem xmlns:ds="http://schemas.openxmlformats.org/officeDocument/2006/customXml" ds:itemID="{93481E07-2ED6-4F16-8AC5-A2CFC51CF16E}">
+  <ds:schemaRefs>
+    <ds:schemaRef ds:uri="http://schemas.microsoft.com/sharepoint/v3/contenttype/forms"/>
+  </ds:schemaRefs>
+</ds:datastoreItem>
 </file>
 
 <file path=customXml/itemProps4.xml><?xml version="1.0" encoding="utf-8"?>
-<ds:datastoreItem xmlns:ds="http://schemas.openxmlformats.org/officeDocument/2006/customXml" ds:itemID="{C156A047-CF4F-4B15-B343-F838027B8778}"/>
+<ds:datastoreItem xmlns:ds="http://schemas.openxmlformats.org/officeDocument/2006/customXml" ds:itemID="{3734E2DA-EE48-45F5-BCED-921423D5FDCD}">
+  <ds:schemaRefs>
+    <ds:schemaRef ds:uri="http://schemas.microsoft.com/office/2006/metadata/contentType"/>
+    <ds:schemaRef ds:uri="http://schemas.microsoft.com/office/2006/metadata/properties/metaAttributes"/>
+    <ds:schemaRef ds:uri="http://www.w3.org/2001/XMLSchema"/>
+    <ds:schemaRef ds:uri="http://schemas.microsoft.com/office/2006/metadata/properties"/>
+    <ds:schemaRef ds:uri="316e17ac-3f6f-4b27-9d00-daf60d20f2eb"/>
+    <ds:schemaRef ds:uri="0e72dab6-42b6-4491-a979-7607de6ce368"/>
+    <ds:schemaRef ds:uri="http://schemas.microsoft.com/office/2006/documentManagement/types"/>
+    <ds:schemaRef ds:uri="http://schemas.microsoft.com/office/infopath/2007/PartnerControls"/>
+    <ds:schemaRef ds:uri="http://schemas.openxmlformats.org/package/2006/metadata/core-properties"/>
+    <ds:schemaRef ds:uri="http://purl.org/dc/elements/1.1/"/>
+    <ds:schemaRef ds:uri="http://purl.org/dc/terms/"/>
+    <ds:schemaRef ds:uri="http://schemas.microsoft.com/internal/obd"/>
+  </ds:schemaRefs>
+</ds:datastoreItem>
 </file>
 
 <file path=docMetadata/LabelInfo.xml><?xml version="1.0" encoding="utf-8"?>

</xml_diff>